<commit_message>
Added all recent changes
</commit_message>
<xml_diff>
--- a/documents/Functional Document.docx
+++ b/documents/Functional Document.docx
@@ -5,87 +5,167 @@
     <w:p>
       <w:pPr>
         <w:rPr>
-          <w:b/>
-          <w:bCs/>
-        </w:rPr>
-      </w:pPr>
-      <w:r>
-        <w:rPr>
-          <w:b/>
-          <w:bCs/>
+          <w:rFonts w:ascii="Times New Roman" w:hAnsi="Times New Roman" w:cs="Times New Roman"/>
+          <w:b/>
+          <w:bCs/>
+          <w:sz w:val="28"/>
+          <w:szCs w:val="28"/>
+        </w:rPr>
+      </w:pPr>
+      <w:r>
+        <w:rPr>
+          <w:rFonts w:ascii="Times New Roman" w:hAnsi="Times New Roman" w:cs="Times New Roman"/>
+          <w:b/>
+          <w:bCs/>
+          <w:sz w:val="28"/>
+          <w:szCs w:val="28"/>
         </w:rPr>
         <w:t>Functional Document: Visionary Career Assistance</w:t>
       </w:r>
     </w:p>
-    <w:p/>
-    <w:p>
-      <w:pPr>
-        <w:rPr>
-          <w:b/>
-          <w:bCs/>
-        </w:rPr>
-      </w:pPr>
-      <w:r>
-        <w:rPr>
-          <w:b/>
-          <w:bCs/>
+    <w:p>
+      <w:pPr>
+        <w:rPr>
+          <w:rFonts w:ascii="Times New Roman" w:hAnsi="Times New Roman" w:cs="Times New Roman"/>
+        </w:rPr>
+      </w:pPr>
+    </w:p>
+    <w:p>
+      <w:pPr>
+        <w:rPr>
+          <w:rFonts w:ascii="Times New Roman" w:hAnsi="Times New Roman" w:cs="Times New Roman"/>
+          <w:b/>
+          <w:bCs/>
+          <w:sz w:val="24"/>
+          <w:szCs w:val="24"/>
+        </w:rPr>
+      </w:pPr>
+      <w:r>
+        <w:rPr>
+          <w:rFonts w:ascii="Times New Roman" w:hAnsi="Times New Roman" w:cs="Times New Roman"/>
+          <w:b/>
+          <w:bCs/>
+          <w:sz w:val="24"/>
+          <w:szCs w:val="24"/>
         </w:rPr>
         <w:t>1. Introduction</w:t>
       </w:r>
     </w:p>
     <w:p>
-      <w:r>
+      <w:pPr>
+        <w:rPr>
+          <w:rFonts w:ascii="Times New Roman" w:hAnsi="Times New Roman" w:cs="Times New Roman"/>
+          <w:sz w:val="24"/>
+          <w:szCs w:val="24"/>
+        </w:rPr>
+      </w:pPr>
+      <w:r>
+        <w:rPr>
+          <w:rFonts w:ascii="Times New Roman" w:hAnsi="Times New Roman" w:cs="Times New Roman"/>
+          <w:sz w:val="24"/>
+          <w:szCs w:val="24"/>
+        </w:rPr>
         <w:t xml:space="preserve">Visionary Career Assistance is a digital platform designed to empower students by providing data-driven career insights and personalized mentorship. The application </w:t>
       </w:r>
       <w:proofErr w:type="spellStart"/>
       <w:r>
+        <w:rPr>
+          <w:rFonts w:ascii="Times New Roman" w:hAnsi="Times New Roman" w:cs="Times New Roman"/>
+          <w:sz w:val="24"/>
+          <w:szCs w:val="24"/>
+        </w:rPr>
         <w:t>analyzes</w:t>
       </w:r>
       <w:proofErr w:type="spellEnd"/>
       <w:r>
+        <w:rPr>
+          <w:rFonts w:ascii="Times New Roman" w:hAnsi="Times New Roman" w:cs="Times New Roman"/>
+          <w:sz w:val="24"/>
+          <w:szCs w:val="24"/>
+        </w:rPr>
         <w:t xml:space="preserve"> socio-economic, </w:t>
       </w:r>
       <w:proofErr w:type="spellStart"/>
       <w:r>
+        <w:rPr>
+          <w:rFonts w:ascii="Times New Roman" w:hAnsi="Times New Roman" w:cs="Times New Roman"/>
+          <w:sz w:val="24"/>
+          <w:szCs w:val="24"/>
+        </w:rPr>
         <w:t>behavioral</w:t>
       </w:r>
       <w:proofErr w:type="spellEnd"/>
       <w:r>
+        <w:rPr>
+          <w:rFonts w:ascii="Times New Roman" w:hAnsi="Times New Roman" w:cs="Times New Roman"/>
+          <w:sz w:val="24"/>
+          <w:szCs w:val="24"/>
+        </w:rPr>
         <w:t xml:space="preserve">, and role model influences on career choices while connecting students with verified mentors in their target fields. This document outlines the functional requirements, features, and processes derived from </w:t>
       </w:r>
       <w:r>
         <w:rPr>
-          <w:b/>
-          <w:bCs/>
+          <w:rFonts w:ascii="Times New Roman" w:hAnsi="Times New Roman" w:cs="Times New Roman"/>
+          <w:b/>
+          <w:bCs/>
+          <w:sz w:val="24"/>
+          <w:szCs w:val="24"/>
         </w:rPr>
         <w:t>Sprint 1</w:t>
       </w:r>
       <w:r>
+        <w:rPr>
+          <w:rFonts w:ascii="Times New Roman" w:hAnsi="Times New Roman" w:cs="Times New Roman"/>
+          <w:sz w:val="24"/>
+          <w:szCs w:val="24"/>
+        </w:rPr>
         <w:t xml:space="preserve"> (Data Analysis Dashboard) and </w:t>
       </w:r>
       <w:r>
         <w:rPr>
-          <w:b/>
-          <w:bCs/>
+          <w:rFonts w:ascii="Times New Roman" w:hAnsi="Times New Roman" w:cs="Times New Roman"/>
+          <w:b/>
+          <w:bCs/>
+          <w:sz w:val="24"/>
+          <w:szCs w:val="24"/>
         </w:rPr>
         <w:t>Sprint 2</w:t>
       </w:r>
       <w:r>
+        <w:rPr>
+          <w:rFonts w:ascii="Times New Roman" w:hAnsi="Times New Roman" w:cs="Times New Roman"/>
+          <w:sz w:val="24"/>
+          <w:szCs w:val="24"/>
+        </w:rPr>
         <w:t xml:space="preserve"> (Mentor Matching &amp; UI Enhancements).</w:t>
       </w:r>
     </w:p>
-    <w:p/>
-    <w:p>
-      <w:pPr>
-        <w:rPr>
-          <w:b/>
-          <w:bCs/>
-        </w:rPr>
-      </w:pPr>
-      <w:r>
-        <w:rPr>
-          <w:b/>
-          <w:bCs/>
+    <w:p>
+      <w:pPr>
+        <w:rPr>
+          <w:rFonts w:ascii="Times New Roman" w:hAnsi="Times New Roman" w:cs="Times New Roman"/>
+          <w:sz w:val="24"/>
+          <w:szCs w:val="24"/>
+        </w:rPr>
+      </w:pPr>
+    </w:p>
+    <w:p>
+      <w:pPr>
+        <w:rPr>
+          <w:rFonts w:ascii="Times New Roman" w:hAnsi="Times New Roman" w:cs="Times New Roman"/>
+          <w:b/>
+          <w:bCs/>
+          <w:sz w:val="24"/>
+          <w:szCs w:val="24"/>
+        </w:rPr>
+      </w:pPr>
+      <w:r>
+        <w:rPr>
+          <w:rFonts w:ascii="Times New Roman" w:hAnsi="Times New Roman" w:cs="Times New Roman"/>
+          <w:b/>
+          <w:bCs/>
+          <w:sz w:val="24"/>
+          <w:szCs w:val="24"/>
         </w:rPr>
         <w:t>2. Product Goal</w:t>
       </w:r>
@@ -96,23 +176,47 @@
           <w:ilvl w:val="0"/>
           <w:numId w:val="1"/>
         </w:numPr>
-      </w:pPr>
-      <w:r>
-        <w:rPr>
-          <w:b/>
-          <w:bCs/>
+        <w:ind w:left="0"/>
+        <w:rPr>
+          <w:rFonts w:ascii="Times New Roman" w:hAnsi="Times New Roman" w:cs="Times New Roman"/>
+          <w:sz w:val="24"/>
+          <w:szCs w:val="24"/>
+        </w:rPr>
+      </w:pPr>
+      <w:r>
+        <w:rPr>
+          <w:rFonts w:ascii="Times New Roman" w:hAnsi="Times New Roman" w:cs="Times New Roman"/>
+          <w:b/>
+          <w:bCs/>
+          <w:sz w:val="24"/>
+          <w:szCs w:val="24"/>
         </w:rPr>
         <w:t>Short-Term</w:t>
       </w:r>
       <w:r>
+        <w:rPr>
+          <w:rFonts w:ascii="Times New Roman" w:hAnsi="Times New Roman" w:cs="Times New Roman"/>
+          <w:sz w:val="24"/>
+          <w:szCs w:val="24"/>
+        </w:rPr>
         <w:t xml:space="preserve">: Deliver an interactive dashboard for </w:t>
       </w:r>
       <w:proofErr w:type="spellStart"/>
       <w:r>
+        <w:rPr>
+          <w:rFonts w:ascii="Times New Roman" w:hAnsi="Times New Roman" w:cs="Times New Roman"/>
+          <w:sz w:val="24"/>
+          <w:szCs w:val="24"/>
+        </w:rPr>
         <w:t>analyzing</w:t>
       </w:r>
       <w:proofErr w:type="spellEnd"/>
       <w:r>
+        <w:rPr>
+          <w:rFonts w:ascii="Times New Roman" w:hAnsi="Times New Roman" w:cs="Times New Roman"/>
+          <w:sz w:val="24"/>
+          <w:szCs w:val="24"/>
+        </w:rPr>
         <w:t xml:space="preserve"> career-influencing factors (Sprint 1).</w:t>
       </w:r>
     </w:p>
@@ -122,30 +226,58 @@
           <w:ilvl w:val="0"/>
           <w:numId w:val="1"/>
         </w:numPr>
-      </w:pPr>
-      <w:r>
-        <w:rPr>
-          <w:b/>
-          <w:bCs/>
+        <w:ind w:left="0"/>
+        <w:rPr>
+          <w:rFonts w:ascii="Times New Roman" w:hAnsi="Times New Roman" w:cs="Times New Roman"/>
+          <w:sz w:val="24"/>
+          <w:szCs w:val="24"/>
+        </w:rPr>
+      </w:pPr>
+      <w:r>
+        <w:rPr>
+          <w:rFonts w:ascii="Times New Roman" w:hAnsi="Times New Roman" w:cs="Times New Roman"/>
+          <w:b/>
+          <w:bCs/>
+          <w:sz w:val="24"/>
+          <w:szCs w:val="24"/>
         </w:rPr>
         <w:t>Long-Term</w:t>
       </w:r>
       <w:r>
+        <w:rPr>
+          <w:rFonts w:ascii="Times New Roman" w:hAnsi="Times New Roman" w:cs="Times New Roman"/>
+          <w:sz w:val="24"/>
+          <w:szCs w:val="24"/>
+        </w:rPr>
         <w:t>: Enable seamless mentor-student connections and mobile-first accessibility (Sprint 2).</w:t>
       </w:r>
     </w:p>
-    <w:p/>
-    <w:p>
-      <w:pPr>
-        <w:rPr>
-          <w:b/>
-          <w:bCs/>
-        </w:rPr>
-      </w:pPr>
-      <w:r>
-        <w:rPr>
-          <w:b/>
-          <w:bCs/>
+    <w:p>
+      <w:pPr>
+        <w:rPr>
+          <w:rFonts w:ascii="Times New Roman" w:hAnsi="Times New Roman" w:cs="Times New Roman"/>
+          <w:sz w:val="24"/>
+          <w:szCs w:val="24"/>
+        </w:rPr>
+      </w:pPr>
+    </w:p>
+    <w:p>
+      <w:pPr>
+        <w:rPr>
+          <w:rFonts w:ascii="Times New Roman" w:hAnsi="Times New Roman" w:cs="Times New Roman"/>
+          <w:b/>
+          <w:bCs/>
+          <w:sz w:val="24"/>
+          <w:szCs w:val="24"/>
+        </w:rPr>
+      </w:pPr>
+      <w:r>
+        <w:rPr>
+          <w:rFonts w:ascii="Times New Roman" w:hAnsi="Times New Roman" w:cs="Times New Roman"/>
+          <w:b/>
+          <w:bCs/>
+          <w:sz w:val="24"/>
+          <w:szCs w:val="24"/>
         </w:rPr>
         <w:t>3. Demography</w:t>
       </w:r>
@@ -156,15 +288,29 @@
           <w:ilvl w:val="0"/>
           <w:numId w:val="2"/>
         </w:numPr>
-      </w:pPr>
-      <w:r>
-        <w:rPr>
-          <w:b/>
-          <w:bCs/>
+        <w:ind w:left="0"/>
+        <w:rPr>
+          <w:rFonts w:ascii="Times New Roman" w:hAnsi="Times New Roman" w:cs="Times New Roman"/>
+          <w:sz w:val="24"/>
+          <w:szCs w:val="24"/>
+        </w:rPr>
+      </w:pPr>
+      <w:r>
+        <w:rPr>
+          <w:rFonts w:ascii="Times New Roman" w:hAnsi="Times New Roman" w:cs="Times New Roman"/>
+          <w:b/>
+          <w:bCs/>
+          <w:sz w:val="24"/>
+          <w:szCs w:val="24"/>
         </w:rPr>
         <w:t>Primary Users</w:t>
       </w:r>
       <w:r>
+        <w:rPr>
+          <w:rFonts w:ascii="Times New Roman" w:hAnsi="Times New Roman" w:cs="Times New Roman"/>
+          <w:sz w:val="24"/>
+          <w:szCs w:val="24"/>
+        </w:rPr>
         <w:t>:</w:t>
       </w:r>
     </w:p>
@@ -174,8 +320,19 @@
           <w:ilvl w:val="1"/>
           <w:numId w:val="2"/>
         </w:numPr>
-      </w:pPr>
-      <w:r>
+        <w:ind w:left="0"/>
+        <w:rPr>
+          <w:rFonts w:ascii="Times New Roman" w:hAnsi="Times New Roman" w:cs="Times New Roman"/>
+          <w:sz w:val="24"/>
+          <w:szCs w:val="24"/>
+        </w:rPr>
+      </w:pPr>
+      <w:r>
+        <w:rPr>
+          <w:rFonts w:ascii="Times New Roman" w:hAnsi="Times New Roman" w:cs="Times New Roman"/>
+          <w:sz w:val="24"/>
+          <w:szCs w:val="24"/>
+        </w:rPr>
         <w:t>Students aged 16–25 seeking career guidance.</w:t>
       </w:r>
     </w:p>
@@ -185,8 +342,19 @@
           <w:ilvl w:val="1"/>
           <w:numId w:val="2"/>
         </w:numPr>
-      </w:pPr>
-      <w:r>
+        <w:ind w:left="0"/>
+        <w:rPr>
+          <w:rFonts w:ascii="Times New Roman" w:hAnsi="Times New Roman" w:cs="Times New Roman"/>
+          <w:sz w:val="24"/>
+          <w:szCs w:val="24"/>
+        </w:rPr>
+      </w:pPr>
+      <w:r>
+        <w:rPr>
+          <w:rFonts w:ascii="Times New Roman" w:hAnsi="Times New Roman" w:cs="Times New Roman"/>
+          <w:sz w:val="24"/>
+          <w:szCs w:val="24"/>
+        </w:rPr>
         <w:t>Professionals (mentors) with 5+ years of industry experience.</w:t>
       </w:r>
     </w:p>
@@ -196,15 +364,29 @@
           <w:ilvl w:val="0"/>
           <w:numId w:val="2"/>
         </w:numPr>
-      </w:pPr>
-      <w:r>
-        <w:rPr>
-          <w:b/>
-          <w:bCs/>
+        <w:ind w:left="0"/>
+        <w:rPr>
+          <w:rFonts w:ascii="Times New Roman" w:hAnsi="Times New Roman" w:cs="Times New Roman"/>
+          <w:sz w:val="24"/>
+          <w:szCs w:val="24"/>
+        </w:rPr>
+      </w:pPr>
+      <w:r>
+        <w:rPr>
+          <w:rFonts w:ascii="Times New Roman" w:hAnsi="Times New Roman" w:cs="Times New Roman"/>
+          <w:b/>
+          <w:bCs/>
+          <w:sz w:val="24"/>
+          <w:szCs w:val="24"/>
         </w:rPr>
         <w:t>Secondary Users</w:t>
       </w:r>
       <w:r>
+        <w:rPr>
+          <w:rFonts w:ascii="Times New Roman" w:hAnsi="Times New Roman" w:cs="Times New Roman"/>
+          <w:sz w:val="24"/>
+          <w:szCs w:val="24"/>
+        </w:rPr>
         <w:t>: Administrators managing data and mentor profiles.</w:t>
       </w:r>
     </w:p>
@@ -214,30 +396,58 @@
           <w:ilvl w:val="0"/>
           <w:numId w:val="2"/>
         </w:numPr>
-      </w:pPr>
-      <w:r>
-        <w:rPr>
-          <w:b/>
-          <w:bCs/>
+        <w:ind w:left="0"/>
+        <w:rPr>
+          <w:rFonts w:ascii="Times New Roman" w:hAnsi="Times New Roman" w:cs="Times New Roman"/>
+          <w:sz w:val="24"/>
+          <w:szCs w:val="24"/>
+        </w:rPr>
+      </w:pPr>
+      <w:r>
+        <w:rPr>
+          <w:rFonts w:ascii="Times New Roman" w:hAnsi="Times New Roman" w:cs="Times New Roman"/>
+          <w:b/>
+          <w:bCs/>
+          <w:sz w:val="24"/>
+          <w:szCs w:val="24"/>
         </w:rPr>
         <w:t>Location</w:t>
       </w:r>
       <w:r>
+        <w:rPr>
+          <w:rFonts w:ascii="Times New Roman" w:hAnsi="Times New Roman" w:cs="Times New Roman"/>
+          <w:sz w:val="24"/>
+          <w:szCs w:val="24"/>
+        </w:rPr>
         <w:t>: Initially targeting urban educational institutions in North America and Europe.</w:t>
       </w:r>
     </w:p>
-    <w:p/>
-    <w:p>
-      <w:pPr>
-        <w:rPr>
-          <w:b/>
-          <w:bCs/>
-        </w:rPr>
-      </w:pPr>
-      <w:r>
-        <w:rPr>
-          <w:b/>
-          <w:bCs/>
+    <w:p>
+      <w:pPr>
+        <w:rPr>
+          <w:rFonts w:ascii="Times New Roman" w:hAnsi="Times New Roman" w:cs="Times New Roman"/>
+          <w:sz w:val="24"/>
+          <w:szCs w:val="24"/>
+        </w:rPr>
+      </w:pPr>
+    </w:p>
+    <w:p>
+      <w:pPr>
+        <w:rPr>
+          <w:rFonts w:ascii="Times New Roman" w:hAnsi="Times New Roman" w:cs="Times New Roman"/>
+          <w:b/>
+          <w:bCs/>
+          <w:sz w:val="24"/>
+          <w:szCs w:val="24"/>
+        </w:rPr>
+      </w:pPr>
+      <w:r>
+        <w:rPr>
+          <w:rFonts w:ascii="Times New Roman" w:hAnsi="Times New Roman" w:cs="Times New Roman"/>
+          <w:b/>
+          <w:bCs/>
+          <w:sz w:val="24"/>
+          <w:szCs w:val="24"/>
         </w:rPr>
         <w:t>4. Business Processes</w:t>
       </w:r>
@@ -248,23 +458,47 @@
           <w:ilvl w:val="0"/>
           <w:numId w:val="3"/>
         </w:numPr>
-      </w:pPr>
-      <w:r>
-        <w:rPr>
-          <w:b/>
-          <w:bCs/>
+        <w:ind w:left="0"/>
+        <w:rPr>
+          <w:rFonts w:ascii="Times New Roman" w:hAnsi="Times New Roman" w:cs="Times New Roman"/>
+          <w:sz w:val="24"/>
+          <w:szCs w:val="24"/>
+        </w:rPr>
+      </w:pPr>
+      <w:r>
+        <w:rPr>
+          <w:rFonts w:ascii="Times New Roman" w:hAnsi="Times New Roman" w:cs="Times New Roman"/>
+          <w:b/>
+          <w:bCs/>
+          <w:sz w:val="24"/>
+          <w:szCs w:val="24"/>
         </w:rPr>
         <w:t>Data Collection</w:t>
       </w:r>
       <w:r>
+        <w:rPr>
+          <w:rFonts w:ascii="Times New Roman" w:hAnsi="Times New Roman" w:cs="Times New Roman"/>
+          <w:sz w:val="24"/>
+          <w:szCs w:val="24"/>
+        </w:rPr>
         <w:t xml:space="preserve">: Students input socio-economic, </w:t>
       </w:r>
       <w:proofErr w:type="spellStart"/>
       <w:r>
+        <w:rPr>
+          <w:rFonts w:ascii="Times New Roman" w:hAnsi="Times New Roman" w:cs="Times New Roman"/>
+          <w:sz w:val="24"/>
+          <w:szCs w:val="24"/>
+        </w:rPr>
         <w:t>behavioral</w:t>
       </w:r>
       <w:proofErr w:type="spellEnd"/>
       <w:r>
+        <w:rPr>
+          <w:rFonts w:ascii="Times New Roman" w:hAnsi="Times New Roman" w:cs="Times New Roman"/>
+          <w:sz w:val="24"/>
+          <w:szCs w:val="24"/>
+        </w:rPr>
         <w:t>, and role model data.</w:t>
       </w:r>
     </w:p>
@@ -274,15 +508,29 @@
           <w:ilvl w:val="0"/>
           <w:numId w:val="3"/>
         </w:numPr>
-      </w:pPr>
-      <w:r>
-        <w:rPr>
-          <w:b/>
-          <w:bCs/>
+        <w:ind w:left="0"/>
+        <w:rPr>
+          <w:rFonts w:ascii="Times New Roman" w:hAnsi="Times New Roman" w:cs="Times New Roman"/>
+          <w:sz w:val="24"/>
+          <w:szCs w:val="24"/>
+        </w:rPr>
+      </w:pPr>
+      <w:r>
+        <w:rPr>
+          <w:rFonts w:ascii="Times New Roman" w:hAnsi="Times New Roman" w:cs="Times New Roman"/>
+          <w:b/>
+          <w:bCs/>
+          <w:sz w:val="24"/>
+          <w:szCs w:val="24"/>
         </w:rPr>
         <w:t>Analysis</w:t>
       </w:r>
       <w:r>
+        <w:rPr>
+          <w:rFonts w:ascii="Times New Roman" w:hAnsi="Times New Roman" w:cs="Times New Roman"/>
+          <w:sz w:val="24"/>
+          <w:szCs w:val="24"/>
+        </w:rPr>
         <w:t>: The system computes metrics (e.g., sentiment scores, income bracket comparisons).</w:t>
       </w:r>
     </w:p>
@@ -292,15 +540,29 @@
           <w:ilvl w:val="0"/>
           <w:numId w:val="3"/>
         </w:numPr>
-      </w:pPr>
-      <w:r>
-        <w:rPr>
-          <w:b/>
-          <w:bCs/>
+        <w:ind w:left="0"/>
+        <w:rPr>
+          <w:rFonts w:ascii="Times New Roman" w:hAnsi="Times New Roman" w:cs="Times New Roman"/>
+          <w:sz w:val="24"/>
+          <w:szCs w:val="24"/>
+        </w:rPr>
+      </w:pPr>
+      <w:r>
+        <w:rPr>
+          <w:rFonts w:ascii="Times New Roman" w:hAnsi="Times New Roman" w:cs="Times New Roman"/>
+          <w:b/>
+          <w:bCs/>
+          <w:sz w:val="24"/>
+          <w:szCs w:val="24"/>
         </w:rPr>
         <w:t>Visualization</w:t>
       </w:r>
       <w:r>
+        <w:rPr>
+          <w:rFonts w:ascii="Times New Roman" w:hAnsi="Times New Roman" w:cs="Times New Roman"/>
+          <w:sz w:val="24"/>
+          <w:szCs w:val="24"/>
+        </w:rPr>
         <w:t>: Interactive dashboards display insights via charts and tooltips.</w:t>
       </w:r>
     </w:p>
@@ -310,15 +572,29 @@
           <w:ilvl w:val="0"/>
           <w:numId w:val="3"/>
         </w:numPr>
-      </w:pPr>
-      <w:r>
-        <w:rPr>
-          <w:b/>
-          <w:bCs/>
+        <w:ind w:left="0"/>
+        <w:rPr>
+          <w:rFonts w:ascii="Times New Roman" w:hAnsi="Times New Roman" w:cs="Times New Roman"/>
+          <w:sz w:val="24"/>
+          <w:szCs w:val="24"/>
+        </w:rPr>
+      </w:pPr>
+      <w:r>
+        <w:rPr>
+          <w:rFonts w:ascii="Times New Roman" w:hAnsi="Times New Roman" w:cs="Times New Roman"/>
+          <w:b/>
+          <w:bCs/>
+          <w:sz w:val="24"/>
+          <w:szCs w:val="24"/>
         </w:rPr>
         <w:t>Mentor Matching</w:t>
       </w:r>
       <w:r>
+        <w:rPr>
+          <w:rFonts w:ascii="Times New Roman" w:hAnsi="Times New Roman" w:cs="Times New Roman"/>
+          <w:sz w:val="24"/>
+          <w:szCs w:val="24"/>
+        </w:rPr>
         <w:t>: Algorithm matches students with mentors based on interests and expertise.</w:t>
       </w:r>
     </w:p>
@@ -328,29 +604,49 @@
           <w:ilvl w:val="0"/>
           <w:numId w:val="3"/>
         </w:numPr>
-      </w:pPr>
-      <w:r>
-        <w:rPr>
-          <w:b/>
-          <w:bCs/>
+        <w:ind w:left="0"/>
+        <w:rPr>
+          <w:rFonts w:ascii="Times New Roman" w:hAnsi="Times New Roman" w:cs="Times New Roman"/>
+          <w:sz w:val="24"/>
+          <w:szCs w:val="24"/>
+        </w:rPr>
+      </w:pPr>
+      <w:r>
+        <w:rPr>
+          <w:rFonts w:ascii="Times New Roman" w:hAnsi="Times New Roman" w:cs="Times New Roman"/>
+          <w:b/>
+          <w:bCs/>
+          <w:sz w:val="24"/>
+          <w:szCs w:val="24"/>
         </w:rPr>
         <w:t>Session Booking</w:t>
       </w:r>
       <w:r>
+        <w:rPr>
+          <w:rFonts w:ascii="Times New Roman" w:hAnsi="Times New Roman" w:cs="Times New Roman"/>
+          <w:sz w:val="24"/>
+          <w:szCs w:val="24"/>
+        </w:rPr>
         <w:t>: Students book sessions with mentors through verified profiles.</w:t>
       </w:r>
     </w:p>
     <w:p>
       <w:pPr>
         <w:rPr>
-          <w:b/>
-          <w:bCs/>
-        </w:rPr>
-      </w:pPr>
-      <w:r>
-        <w:rPr>
-          <w:b/>
-          <w:bCs/>
+          <w:rFonts w:ascii="Times New Roman" w:hAnsi="Times New Roman" w:cs="Times New Roman"/>
+          <w:b/>
+          <w:bCs/>
+          <w:sz w:val="24"/>
+          <w:szCs w:val="24"/>
+        </w:rPr>
+      </w:pPr>
+      <w:r>
+        <w:rPr>
+          <w:rFonts w:ascii="Times New Roman" w:hAnsi="Times New Roman" w:cs="Times New Roman"/>
+          <w:b/>
+          <w:bCs/>
+          <w:sz w:val="24"/>
+          <w:szCs w:val="24"/>
         </w:rPr>
         <w:t>5. Features</w:t>
       </w:r>
@@ -358,14 +654,20 @@
     <w:p>
       <w:pPr>
         <w:rPr>
-          <w:b/>
-          <w:bCs/>
-        </w:rPr>
-      </w:pPr>
-      <w:r>
-        <w:rPr>
-          <w:b/>
-          <w:bCs/>
+          <w:rFonts w:ascii="Times New Roman" w:hAnsi="Times New Roman" w:cs="Times New Roman"/>
+          <w:b/>
+          <w:bCs/>
+          <w:sz w:val="24"/>
+          <w:szCs w:val="24"/>
+        </w:rPr>
+      </w:pPr>
+      <w:r>
+        <w:rPr>
+          <w:rFonts w:ascii="Times New Roman" w:hAnsi="Times New Roman" w:cs="Times New Roman"/>
+          <w:b/>
+          <w:bCs/>
+          <w:sz w:val="24"/>
+          <w:szCs w:val="24"/>
         </w:rPr>
         <w:t>5.1 Feature #1: Career Analysis Dashboard</w:t>
       </w:r>
@@ -376,28 +678,57 @@
           <w:ilvl w:val="0"/>
           <w:numId w:val="4"/>
         </w:numPr>
-      </w:pPr>
-      <w:r>
-        <w:rPr>
-          <w:b/>
-          <w:bCs/>
+        <w:ind w:left="0"/>
+        <w:rPr>
+          <w:rFonts w:ascii="Times New Roman" w:hAnsi="Times New Roman" w:cs="Times New Roman"/>
+          <w:sz w:val="24"/>
+          <w:szCs w:val="24"/>
+        </w:rPr>
+      </w:pPr>
+      <w:r>
+        <w:rPr>
+          <w:rFonts w:ascii="Times New Roman" w:hAnsi="Times New Roman" w:cs="Times New Roman"/>
+          <w:b/>
+          <w:bCs/>
+          <w:sz w:val="24"/>
+          <w:szCs w:val="24"/>
         </w:rPr>
         <w:lastRenderedPageBreak/>
         <w:t>Description</w:t>
       </w:r>
       <w:r>
+        <w:rPr>
+          <w:rFonts w:ascii="Times New Roman" w:hAnsi="Times New Roman" w:cs="Times New Roman"/>
+          <w:sz w:val="24"/>
+          <w:szCs w:val="24"/>
+        </w:rPr>
         <w:t>:</w:t>
       </w:r>
       <w:r>
+        <w:rPr>
+          <w:rFonts w:ascii="Times New Roman" w:hAnsi="Times New Roman" w:cs="Times New Roman"/>
+          <w:sz w:val="24"/>
+          <w:szCs w:val="24"/>
+        </w:rPr>
         <w:br/>
         <w:t xml:space="preserve">A centralized interface for students to visualize career-influencing factors, including role model impacts, socio-economic backgrounds, </w:t>
       </w:r>
       <w:proofErr w:type="spellStart"/>
       <w:r>
+        <w:rPr>
+          <w:rFonts w:ascii="Times New Roman" w:hAnsi="Times New Roman" w:cs="Times New Roman"/>
+          <w:sz w:val="24"/>
+          <w:szCs w:val="24"/>
+        </w:rPr>
         <w:t>behavioral</w:t>
       </w:r>
       <w:proofErr w:type="spellEnd"/>
       <w:r>
+        <w:rPr>
+          <w:rFonts w:ascii="Times New Roman" w:hAnsi="Times New Roman" w:cs="Times New Roman"/>
+          <w:sz w:val="24"/>
+          <w:szCs w:val="24"/>
+        </w:rPr>
         <w:t xml:space="preserve"> trends, and income bracket analyses.</w:t>
       </w:r>
     </w:p>
@@ -407,15 +738,29 @@
           <w:ilvl w:val="0"/>
           <w:numId w:val="4"/>
         </w:numPr>
-      </w:pPr>
-      <w:r>
-        <w:rPr>
-          <w:b/>
-          <w:bCs/>
+        <w:ind w:left="0"/>
+        <w:rPr>
+          <w:rFonts w:ascii="Times New Roman" w:hAnsi="Times New Roman" w:cs="Times New Roman"/>
+          <w:sz w:val="24"/>
+          <w:szCs w:val="24"/>
+        </w:rPr>
+      </w:pPr>
+      <w:r>
+        <w:rPr>
+          <w:rFonts w:ascii="Times New Roman" w:hAnsi="Times New Roman" w:cs="Times New Roman"/>
+          <w:b/>
+          <w:bCs/>
+          <w:sz w:val="24"/>
+          <w:szCs w:val="24"/>
         </w:rPr>
         <w:t>User Stories</w:t>
       </w:r>
       <w:r>
+        <w:rPr>
+          <w:rFonts w:ascii="Times New Roman" w:hAnsi="Times New Roman" w:cs="Times New Roman"/>
+          <w:sz w:val="24"/>
+          <w:szCs w:val="24"/>
+        </w:rPr>
         <w:t>:</w:t>
       </w:r>
     </w:p>
@@ -425,8 +770,19 @@
           <w:ilvl w:val="1"/>
           <w:numId w:val="4"/>
         </w:numPr>
-      </w:pPr>
-      <w:r>
+        <w:ind w:left="0"/>
+        <w:rPr>
+          <w:rFonts w:ascii="Times New Roman" w:hAnsi="Times New Roman" w:cs="Times New Roman"/>
+          <w:sz w:val="24"/>
+          <w:szCs w:val="24"/>
+        </w:rPr>
+      </w:pPr>
+      <w:r>
+        <w:rPr>
+          <w:rFonts w:ascii="Times New Roman" w:hAnsi="Times New Roman" w:cs="Times New Roman"/>
+          <w:sz w:val="24"/>
+          <w:szCs w:val="24"/>
+        </w:rPr>
         <w:t>Role Model Impact Visualization (Sprint 1).</w:t>
       </w:r>
     </w:p>
@@ -436,8 +792,19 @@
           <w:ilvl w:val="1"/>
           <w:numId w:val="4"/>
         </w:numPr>
-      </w:pPr>
-      <w:r>
+        <w:ind w:left="0"/>
+        <w:rPr>
+          <w:rFonts w:ascii="Times New Roman" w:hAnsi="Times New Roman" w:cs="Times New Roman"/>
+          <w:sz w:val="24"/>
+          <w:szCs w:val="24"/>
+        </w:rPr>
+      </w:pPr>
+      <w:r>
+        <w:rPr>
+          <w:rFonts w:ascii="Times New Roman" w:hAnsi="Times New Roman" w:cs="Times New Roman"/>
+          <w:sz w:val="24"/>
+          <w:szCs w:val="24"/>
+        </w:rPr>
         <w:t>Socio-Economic Background Insights (Sprint 1).</w:t>
       </w:r>
     </w:p>
@@ -447,13 +814,29 @@
           <w:ilvl w:val="1"/>
           <w:numId w:val="4"/>
         </w:numPr>
+        <w:ind w:left="0"/>
+        <w:rPr>
+          <w:rFonts w:ascii="Times New Roman" w:hAnsi="Times New Roman" w:cs="Times New Roman"/>
+          <w:sz w:val="24"/>
+          <w:szCs w:val="24"/>
+        </w:rPr>
       </w:pPr>
       <w:proofErr w:type="spellStart"/>
       <w:r>
+        <w:rPr>
+          <w:rFonts w:ascii="Times New Roman" w:hAnsi="Times New Roman" w:cs="Times New Roman"/>
+          <w:sz w:val="24"/>
+          <w:szCs w:val="24"/>
+        </w:rPr>
         <w:t>Behavioral</w:t>
       </w:r>
       <w:proofErr w:type="spellEnd"/>
       <w:r>
+        <w:rPr>
+          <w:rFonts w:ascii="Times New Roman" w:hAnsi="Times New Roman" w:cs="Times New Roman"/>
+          <w:sz w:val="24"/>
+          <w:szCs w:val="24"/>
+        </w:rPr>
         <w:t xml:space="preserve"> Pattern Tracking (Sprint 1).</w:t>
       </w:r>
     </w:p>
@@ -463,22 +846,39 @@
           <w:ilvl w:val="1"/>
           <w:numId w:val="4"/>
         </w:numPr>
-      </w:pPr>
-      <w:r>
+        <w:ind w:left="0"/>
+        <w:rPr>
+          <w:rFonts w:ascii="Times New Roman" w:hAnsi="Times New Roman" w:cs="Times New Roman"/>
+          <w:sz w:val="24"/>
+          <w:szCs w:val="24"/>
+        </w:rPr>
+      </w:pPr>
+      <w:r>
+        <w:rPr>
+          <w:rFonts w:ascii="Times New Roman" w:hAnsi="Times New Roman" w:cs="Times New Roman"/>
+          <w:sz w:val="24"/>
+          <w:szCs w:val="24"/>
+        </w:rPr>
         <w:t>Income Bracket Analysis (Sprint 1).</w:t>
       </w:r>
     </w:p>
     <w:p>
       <w:pPr>
         <w:rPr>
-          <w:b/>
-          <w:bCs/>
-        </w:rPr>
-      </w:pPr>
-      <w:r>
-        <w:rPr>
-          <w:b/>
-          <w:bCs/>
+          <w:rFonts w:ascii="Times New Roman" w:hAnsi="Times New Roman" w:cs="Times New Roman"/>
+          <w:b/>
+          <w:bCs/>
+          <w:sz w:val="24"/>
+          <w:szCs w:val="24"/>
+        </w:rPr>
+      </w:pPr>
+      <w:r>
+        <w:rPr>
+          <w:rFonts w:ascii="Times New Roman" w:hAnsi="Times New Roman" w:cs="Times New Roman"/>
+          <w:b/>
+          <w:bCs/>
+          <w:sz w:val="24"/>
+          <w:szCs w:val="24"/>
         </w:rPr>
         <w:t>5.2 Feature #2: Mentor Matching System</w:t>
       </w:r>
@@ -489,18 +889,37 @@
           <w:ilvl w:val="0"/>
           <w:numId w:val="5"/>
         </w:numPr>
-      </w:pPr>
-      <w:r>
-        <w:rPr>
-          <w:b/>
-          <w:bCs/>
+        <w:ind w:left="0"/>
+        <w:rPr>
+          <w:rFonts w:ascii="Times New Roman" w:hAnsi="Times New Roman" w:cs="Times New Roman"/>
+          <w:sz w:val="24"/>
+          <w:szCs w:val="24"/>
+        </w:rPr>
+      </w:pPr>
+      <w:r>
+        <w:rPr>
+          <w:rFonts w:ascii="Times New Roman" w:hAnsi="Times New Roman" w:cs="Times New Roman"/>
+          <w:b/>
+          <w:bCs/>
+          <w:sz w:val="24"/>
+          <w:szCs w:val="24"/>
         </w:rPr>
         <w:t>Description</w:t>
       </w:r>
       <w:r>
+        <w:rPr>
+          <w:rFonts w:ascii="Times New Roman" w:hAnsi="Times New Roman" w:cs="Times New Roman"/>
+          <w:sz w:val="24"/>
+          <w:szCs w:val="24"/>
+        </w:rPr>
         <w:t>:</w:t>
       </w:r>
       <w:r>
+        <w:rPr>
+          <w:rFonts w:ascii="Times New Roman" w:hAnsi="Times New Roman" w:cs="Times New Roman"/>
+          <w:sz w:val="24"/>
+          <w:szCs w:val="24"/>
+        </w:rPr>
         <w:br/>
         <w:t>A tool to discover, match, and connect with mentors based on industry, expertise, and student interests.</w:t>
       </w:r>
@@ -511,15 +930,29 @@
           <w:ilvl w:val="0"/>
           <w:numId w:val="5"/>
         </w:numPr>
-      </w:pPr>
-      <w:r>
-        <w:rPr>
-          <w:b/>
-          <w:bCs/>
+        <w:ind w:left="0"/>
+        <w:rPr>
+          <w:rFonts w:ascii="Times New Roman" w:hAnsi="Times New Roman" w:cs="Times New Roman"/>
+          <w:sz w:val="24"/>
+          <w:szCs w:val="24"/>
+        </w:rPr>
+      </w:pPr>
+      <w:r>
+        <w:rPr>
+          <w:rFonts w:ascii="Times New Roman" w:hAnsi="Times New Roman" w:cs="Times New Roman"/>
+          <w:b/>
+          <w:bCs/>
+          <w:sz w:val="24"/>
+          <w:szCs w:val="24"/>
         </w:rPr>
         <w:t>User Stories</w:t>
       </w:r>
       <w:r>
+        <w:rPr>
+          <w:rFonts w:ascii="Times New Roman" w:hAnsi="Times New Roman" w:cs="Times New Roman"/>
+          <w:sz w:val="24"/>
+          <w:szCs w:val="24"/>
+        </w:rPr>
         <w:t>:</w:t>
       </w:r>
     </w:p>
@@ -529,8 +962,19 @@
           <w:ilvl w:val="1"/>
           <w:numId w:val="5"/>
         </w:numPr>
-      </w:pPr>
-      <w:r>
+        <w:ind w:left="0"/>
+        <w:rPr>
+          <w:rFonts w:ascii="Times New Roman" w:hAnsi="Times New Roman" w:cs="Times New Roman"/>
+          <w:sz w:val="24"/>
+          <w:szCs w:val="24"/>
+        </w:rPr>
+      </w:pPr>
+      <w:r>
+        <w:rPr>
+          <w:rFonts w:ascii="Times New Roman" w:hAnsi="Times New Roman" w:cs="Times New Roman"/>
+          <w:sz w:val="24"/>
+          <w:szCs w:val="24"/>
+        </w:rPr>
         <w:t>Mentor Profile Discovery (Sprint 2).</w:t>
       </w:r>
     </w:p>
@@ -540,22 +984,39 @@
           <w:ilvl w:val="1"/>
           <w:numId w:val="5"/>
         </w:numPr>
-      </w:pPr>
-      <w:r>
+        <w:ind w:left="0"/>
+        <w:rPr>
+          <w:rFonts w:ascii="Times New Roman" w:hAnsi="Times New Roman" w:cs="Times New Roman"/>
+          <w:sz w:val="24"/>
+          <w:szCs w:val="24"/>
+        </w:rPr>
+      </w:pPr>
+      <w:r>
+        <w:rPr>
+          <w:rFonts w:ascii="Times New Roman" w:hAnsi="Times New Roman" w:cs="Times New Roman"/>
+          <w:sz w:val="24"/>
+          <w:szCs w:val="24"/>
+        </w:rPr>
         <w:t>Career Interest Matching (Sprint 2).</w:t>
       </w:r>
     </w:p>
     <w:p>
       <w:pPr>
         <w:rPr>
-          <w:b/>
-          <w:bCs/>
-        </w:rPr>
-      </w:pPr>
-      <w:r>
-        <w:rPr>
-          <w:b/>
-          <w:bCs/>
+          <w:rFonts w:ascii="Times New Roman" w:hAnsi="Times New Roman" w:cs="Times New Roman"/>
+          <w:b/>
+          <w:bCs/>
+          <w:sz w:val="24"/>
+          <w:szCs w:val="24"/>
+        </w:rPr>
+      </w:pPr>
+      <w:r>
+        <w:rPr>
+          <w:rFonts w:ascii="Times New Roman" w:hAnsi="Times New Roman" w:cs="Times New Roman"/>
+          <w:b/>
+          <w:bCs/>
+          <w:sz w:val="24"/>
+          <w:szCs w:val="24"/>
         </w:rPr>
         <w:t>5.3 Feature #3: Mobile-First Interface</w:t>
       </w:r>
@@ -566,18 +1027,37 @@
           <w:ilvl w:val="0"/>
           <w:numId w:val="6"/>
         </w:numPr>
-      </w:pPr>
-      <w:r>
-        <w:rPr>
-          <w:b/>
-          <w:bCs/>
+        <w:ind w:left="0"/>
+        <w:rPr>
+          <w:rFonts w:ascii="Times New Roman" w:hAnsi="Times New Roman" w:cs="Times New Roman"/>
+          <w:sz w:val="24"/>
+          <w:szCs w:val="24"/>
+        </w:rPr>
+      </w:pPr>
+      <w:r>
+        <w:rPr>
+          <w:rFonts w:ascii="Times New Roman" w:hAnsi="Times New Roman" w:cs="Times New Roman"/>
+          <w:b/>
+          <w:bCs/>
+          <w:sz w:val="24"/>
+          <w:szCs w:val="24"/>
         </w:rPr>
         <w:t>Description</w:t>
       </w:r>
       <w:r>
+        <w:rPr>
+          <w:rFonts w:ascii="Times New Roman" w:hAnsi="Times New Roman" w:cs="Times New Roman"/>
+          <w:sz w:val="24"/>
+          <w:szCs w:val="24"/>
+        </w:rPr>
         <w:t>:</w:t>
       </w:r>
       <w:r>
+        <w:rPr>
+          <w:rFonts w:ascii="Times New Roman" w:hAnsi="Times New Roman" w:cs="Times New Roman"/>
+          <w:sz w:val="24"/>
+          <w:szCs w:val="24"/>
+        </w:rPr>
         <w:br/>
         <w:t>Responsive design optimized for mobile devices, enabling access to dashboards and mentor features on-the-go.</w:t>
       </w:r>
@@ -588,15 +1068,29 @@
           <w:ilvl w:val="0"/>
           <w:numId w:val="6"/>
         </w:numPr>
-      </w:pPr>
-      <w:r>
-        <w:rPr>
-          <w:b/>
-          <w:bCs/>
+        <w:ind w:left="0"/>
+        <w:rPr>
+          <w:rFonts w:ascii="Times New Roman" w:hAnsi="Times New Roman" w:cs="Times New Roman"/>
+          <w:sz w:val="24"/>
+          <w:szCs w:val="24"/>
+        </w:rPr>
+      </w:pPr>
+      <w:r>
+        <w:rPr>
+          <w:rFonts w:ascii="Times New Roman" w:hAnsi="Times New Roman" w:cs="Times New Roman"/>
+          <w:b/>
+          <w:bCs/>
+          <w:sz w:val="24"/>
+          <w:szCs w:val="24"/>
         </w:rPr>
         <w:t>User Stories</w:t>
       </w:r>
       <w:r>
+        <w:rPr>
+          <w:rFonts w:ascii="Times New Roman" w:hAnsi="Times New Roman" w:cs="Times New Roman"/>
+          <w:sz w:val="24"/>
+          <w:szCs w:val="24"/>
+        </w:rPr>
         <w:t>:</w:t>
       </w:r>
     </w:p>
@@ -606,8 +1100,19 @@
           <w:ilvl w:val="1"/>
           <w:numId w:val="6"/>
         </w:numPr>
-      </w:pPr>
-      <w:r>
+        <w:ind w:left="0"/>
+        <w:rPr>
+          <w:rFonts w:ascii="Times New Roman" w:hAnsi="Times New Roman" w:cs="Times New Roman"/>
+          <w:sz w:val="24"/>
+          <w:szCs w:val="24"/>
+        </w:rPr>
+      </w:pPr>
+      <w:r>
+        <w:rPr>
+          <w:rFonts w:ascii="Times New Roman" w:hAnsi="Times New Roman" w:cs="Times New Roman"/>
+          <w:sz w:val="24"/>
+          <w:szCs w:val="24"/>
+        </w:rPr>
         <w:t>Mobile-First Dashboard Access (Sprint 2).</w:t>
       </w:r>
     </w:p>
@@ -617,22 +1122,39 @@
           <w:ilvl w:val="1"/>
           <w:numId w:val="6"/>
         </w:numPr>
-      </w:pPr>
-      <w:r>
+        <w:ind w:left="0"/>
+        <w:rPr>
+          <w:rFonts w:ascii="Times New Roman" w:hAnsi="Times New Roman" w:cs="Times New Roman"/>
+          <w:sz w:val="24"/>
+          <w:szCs w:val="24"/>
+        </w:rPr>
+      </w:pPr>
+      <w:r>
+        <w:rPr>
+          <w:rFonts w:ascii="Times New Roman" w:hAnsi="Times New Roman" w:cs="Times New Roman"/>
+          <w:sz w:val="24"/>
+          <w:szCs w:val="24"/>
+        </w:rPr>
         <w:t>Interactive Data Exploration (Sprint 2).</w:t>
       </w:r>
     </w:p>
     <w:p>
       <w:pPr>
         <w:rPr>
-          <w:b/>
-          <w:bCs/>
-        </w:rPr>
-      </w:pPr>
-      <w:r>
-        <w:rPr>
-          <w:b/>
-          <w:bCs/>
+          <w:rFonts w:ascii="Times New Roman" w:hAnsi="Times New Roman" w:cs="Times New Roman"/>
+          <w:b/>
+          <w:bCs/>
+          <w:sz w:val="24"/>
+          <w:szCs w:val="24"/>
+        </w:rPr>
+      </w:pPr>
+      <w:r>
+        <w:rPr>
+          <w:rFonts w:ascii="Times New Roman" w:hAnsi="Times New Roman" w:cs="Times New Roman"/>
+          <w:b/>
+          <w:bCs/>
+          <w:sz w:val="24"/>
+          <w:szCs w:val="24"/>
         </w:rPr>
         <w:t>5.4 Feature #4: Error Handling &amp; Feedback</w:t>
       </w:r>
@@ -643,18 +1165,37 @@
           <w:ilvl w:val="0"/>
           <w:numId w:val="7"/>
         </w:numPr>
-      </w:pPr>
-      <w:r>
-        <w:rPr>
-          <w:b/>
-          <w:bCs/>
+        <w:ind w:left="0"/>
+        <w:rPr>
+          <w:rFonts w:ascii="Times New Roman" w:hAnsi="Times New Roman" w:cs="Times New Roman"/>
+          <w:sz w:val="24"/>
+          <w:szCs w:val="24"/>
+        </w:rPr>
+      </w:pPr>
+      <w:r>
+        <w:rPr>
+          <w:rFonts w:ascii="Times New Roman" w:hAnsi="Times New Roman" w:cs="Times New Roman"/>
+          <w:b/>
+          <w:bCs/>
+          <w:sz w:val="24"/>
+          <w:szCs w:val="24"/>
         </w:rPr>
         <w:t>Description</w:t>
       </w:r>
       <w:r>
+        <w:rPr>
+          <w:rFonts w:ascii="Times New Roman" w:hAnsi="Times New Roman" w:cs="Times New Roman"/>
+          <w:sz w:val="24"/>
+          <w:szCs w:val="24"/>
+        </w:rPr>
         <w:t>:</w:t>
       </w:r>
       <w:r>
+        <w:rPr>
+          <w:rFonts w:ascii="Times New Roman" w:hAnsi="Times New Roman" w:cs="Times New Roman"/>
+          <w:sz w:val="24"/>
+          <w:szCs w:val="24"/>
+        </w:rPr>
         <w:br/>
         <w:t>Clear system feedback during loading, errors, or data mismatches.</w:t>
       </w:r>
@@ -665,15 +1206,29 @@
           <w:ilvl w:val="0"/>
           <w:numId w:val="7"/>
         </w:numPr>
-      </w:pPr>
-      <w:r>
-        <w:rPr>
-          <w:b/>
-          <w:bCs/>
+        <w:ind w:left="0"/>
+        <w:rPr>
+          <w:rFonts w:ascii="Times New Roman" w:hAnsi="Times New Roman" w:cs="Times New Roman"/>
+          <w:sz w:val="24"/>
+          <w:szCs w:val="24"/>
+        </w:rPr>
+      </w:pPr>
+      <w:r>
+        <w:rPr>
+          <w:rFonts w:ascii="Times New Roman" w:hAnsi="Times New Roman" w:cs="Times New Roman"/>
+          <w:b/>
+          <w:bCs/>
+          <w:sz w:val="24"/>
+          <w:szCs w:val="24"/>
         </w:rPr>
         <w:t>User Stories</w:t>
       </w:r>
       <w:r>
+        <w:rPr>
+          <w:rFonts w:ascii="Times New Roman" w:hAnsi="Times New Roman" w:cs="Times New Roman"/>
+          <w:sz w:val="24"/>
+          <w:szCs w:val="24"/>
+        </w:rPr>
         <w:t>:</w:t>
       </w:r>
     </w:p>
@@ -683,23 +1238,48 @@
           <w:ilvl w:val="1"/>
           <w:numId w:val="7"/>
         </w:numPr>
-      </w:pPr>
-      <w:r>
+        <w:ind w:left="0"/>
+        <w:rPr>
+          <w:rFonts w:ascii="Times New Roman" w:hAnsi="Times New Roman" w:cs="Times New Roman"/>
+          <w:sz w:val="24"/>
+          <w:szCs w:val="24"/>
+        </w:rPr>
+      </w:pPr>
+      <w:r>
+        <w:rPr>
+          <w:rFonts w:ascii="Times New Roman" w:hAnsi="Times New Roman" w:cs="Times New Roman"/>
+          <w:sz w:val="24"/>
+          <w:szCs w:val="24"/>
+        </w:rPr>
         <w:t>Error Handling &amp; Loading States (Sprint 2).</w:t>
       </w:r>
     </w:p>
-    <w:p/>
-    <w:p>
-      <w:pPr>
-        <w:rPr>
-          <w:b/>
-          <w:bCs/>
-        </w:rPr>
-      </w:pPr>
-      <w:r>
-        <w:rPr>
-          <w:b/>
-          <w:bCs/>
+    <w:p>
+      <w:pPr>
+        <w:rPr>
+          <w:rFonts w:ascii="Times New Roman" w:hAnsi="Times New Roman" w:cs="Times New Roman"/>
+          <w:sz w:val="24"/>
+          <w:szCs w:val="24"/>
+        </w:rPr>
+      </w:pPr>
+    </w:p>
+    <w:p>
+      <w:pPr>
+        <w:rPr>
+          <w:rFonts w:ascii="Times New Roman" w:hAnsi="Times New Roman" w:cs="Times New Roman"/>
+          <w:b/>
+          <w:bCs/>
+          <w:sz w:val="24"/>
+          <w:szCs w:val="24"/>
+        </w:rPr>
+      </w:pPr>
+      <w:r>
+        <w:rPr>
+          <w:rFonts w:ascii="Times New Roman" w:hAnsi="Times New Roman" w:cs="Times New Roman"/>
+          <w:b/>
+          <w:bCs/>
+          <w:sz w:val="24"/>
+          <w:szCs w:val="24"/>
         </w:rPr>
         <w:t>6. Authorization Matrix</w:t>
       </w:r>
@@ -717,8 +1297,8 @@
         <w:tblLook w:val="04A0" w:firstRow="1" w:lastRow="0" w:firstColumn="1" w:lastColumn="0" w:noHBand="0" w:noVBand="1"/>
       </w:tblPr>
       <w:tblGrid>
-        <w:gridCol w:w="795"/>
-        <w:gridCol w:w="6706"/>
+        <w:gridCol w:w="876"/>
+        <w:gridCol w:w="7100"/>
       </w:tblGrid>
       <w:tr>
         <w:trPr>
@@ -734,14 +1314,20 @@
           <w:p>
             <w:pPr>
               <w:rPr>
+                <w:rFonts w:ascii="Times New Roman" w:hAnsi="Times New Roman" w:cs="Times New Roman"/>
                 <w:b/>
                 <w:bCs/>
+                <w:sz w:val="24"/>
+                <w:szCs w:val="24"/>
               </w:rPr>
             </w:pPr>
             <w:r>
               <w:rPr>
+                <w:rFonts w:ascii="Times New Roman" w:hAnsi="Times New Roman" w:cs="Times New Roman"/>
                 <w:b/>
                 <w:bCs/>
+                <w:sz w:val="24"/>
+                <w:szCs w:val="24"/>
               </w:rPr>
               <w:t>Role</w:t>
             </w:r>
@@ -756,14 +1342,20 @@
           <w:p>
             <w:pPr>
               <w:rPr>
+                <w:rFonts w:ascii="Times New Roman" w:hAnsi="Times New Roman" w:cs="Times New Roman"/>
                 <w:b/>
                 <w:bCs/>
+                <w:sz w:val="24"/>
+                <w:szCs w:val="24"/>
               </w:rPr>
             </w:pPr>
             <w:r>
               <w:rPr>
+                <w:rFonts w:ascii="Times New Roman" w:hAnsi="Times New Roman" w:cs="Times New Roman"/>
                 <w:b/>
                 <w:bCs/>
+                <w:sz w:val="24"/>
+                <w:szCs w:val="24"/>
               </w:rPr>
               <w:t>Permissions</w:t>
             </w:r>
@@ -781,10 +1373,20 @@
             <w:hideMark/>
           </w:tcPr>
           <w:p>
+            <w:pPr>
+              <w:rPr>
+                <w:rFonts w:ascii="Times New Roman" w:hAnsi="Times New Roman" w:cs="Times New Roman"/>
+                <w:sz w:val="24"/>
+                <w:szCs w:val="24"/>
+              </w:rPr>
+            </w:pPr>
             <w:r>
               <w:rPr>
+                <w:rFonts w:ascii="Times New Roman" w:hAnsi="Times New Roman" w:cs="Times New Roman"/>
                 <w:b/>
                 <w:bCs/>
+                <w:sz w:val="24"/>
+                <w:szCs w:val="24"/>
               </w:rPr>
               <w:t>Student</w:t>
             </w:r>
@@ -797,7 +1399,19 @@
             <w:hideMark/>
           </w:tcPr>
           <w:p>
+            <w:pPr>
+              <w:rPr>
+                <w:rFonts w:ascii="Times New Roman" w:hAnsi="Times New Roman" w:cs="Times New Roman"/>
+                <w:sz w:val="24"/>
+                <w:szCs w:val="24"/>
+              </w:rPr>
+            </w:pPr>
             <w:r>
+              <w:rPr>
+                <w:rFonts w:ascii="Times New Roman" w:hAnsi="Times New Roman" w:cs="Times New Roman"/>
+                <w:sz w:val="24"/>
+                <w:szCs w:val="24"/>
+              </w:rPr>
               <w:t>View dashboards, edit personal data, search mentors, book sessions.</w:t>
             </w:r>
           </w:p>
@@ -814,11 +1428,22 @@
             <w:hideMark/>
           </w:tcPr>
           <w:p>
+            <w:pPr>
+              <w:rPr>
+                <w:rFonts w:ascii="Times New Roman" w:hAnsi="Times New Roman" w:cs="Times New Roman"/>
+                <w:sz w:val="24"/>
+                <w:szCs w:val="24"/>
+              </w:rPr>
+            </w:pPr>
             <w:r>
               <w:rPr>
+                <w:rFonts w:ascii="Times New Roman" w:hAnsi="Times New Roman" w:cs="Times New Roman"/>
                 <w:b/>
                 <w:bCs/>
+                <w:sz w:val="24"/>
+                <w:szCs w:val="24"/>
               </w:rPr>
+              <w:lastRenderedPageBreak/>
               <w:t>Mentor</w:t>
             </w:r>
           </w:p>
@@ -830,7 +1455,19 @@
             <w:hideMark/>
           </w:tcPr>
           <w:p>
+            <w:pPr>
+              <w:rPr>
+                <w:rFonts w:ascii="Times New Roman" w:hAnsi="Times New Roman" w:cs="Times New Roman"/>
+                <w:sz w:val="24"/>
+                <w:szCs w:val="24"/>
+              </w:rPr>
+            </w:pPr>
             <w:r>
+              <w:rPr>
+                <w:rFonts w:ascii="Times New Roman" w:hAnsi="Times New Roman" w:cs="Times New Roman"/>
+                <w:sz w:val="24"/>
+                <w:szCs w:val="24"/>
+              </w:rPr>
               <w:t>Manage profile, accept/reject session requests, view match scores.</w:t>
             </w:r>
           </w:p>
@@ -847,12 +1484,21 @@
             <w:hideMark/>
           </w:tcPr>
           <w:p>
+            <w:pPr>
+              <w:rPr>
+                <w:rFonts w:ascii="Times New Roman" w:hAnsi="Times New Roman" w:cs="Times New Roman"/>
+                <w:sz w:val="24"/>
+                <w:szCs w:val="24"/>
+              </w:rPr>
+            </w:pPr>
             <w:r>
               <w:rPr>
+                <w:rFonts w:ascii="Times New Roman" w:hAnsi="Times New Roman" w:cs="Times New Roman"/>
                 <w:b/>
                 <w:bCs/>
+                <w:sz w:val="24"/>
+                <w:szCs w:val="24"/>
               </w:rPr>
-              <w:lastRenderedPageBreak/>
               <w:t>Admin</w:t>
             </w:r>
           </w:p>
@@ -864,25 +1510,51 @@
             <w:hideMark/>
           </w:tcPr>
           <w:p>
+            <w:pPr>
+              <w:rPr>
+                <w:rFonts w:ascii="Times New Roman" w:hAnsi="Times New Roman" w:cs="Times New Roman"/>
+                <w:sz w:val="24"/>
+                <w:szCs w:val="24"/>
+              </w:rPr>
+            </w:pPr>
             <w:r>
+              <w:rPr>
+                <w:rFonts w:ascii="Times New Roman" w:hAnsi="Times New Roman" w:cs="Times New Roman"/>
+                <w:sz w:val="24"/>
+                <w:szCs w:val="24"/>
+              </w:rPr>
               <w:t>Oversee user/mentor data, configure algorithms, generate system reports.</w:t>
             </w:r>
           </w:p>
         </w:tc>
       </w:tr>
     </w:tbl>
-    <w:p/>
-    <w:p>
-      <w:pPr>
-        <w:rPr>
-          <w:b/>
-          <w:bCs/>
-        </w:rPr>
-      </w:pPr>
-      <w:r>
-        <w:rPr>
-          <w:b/>
-          <w:bCs/>
+    <w:p>
+      <w:pPr>
+        <w:rPr>
+          <w:rFonts w:ascii="Times New Roman" w:hAnsi="Times New Roman" w:cs="Times New Roman"/>
+          <w:sz w:val="24"/>
+          <w:szCs w:val="24"/>
+        </w:rPr>
+      </w:pPr>
+    </w:p>
+    <w:p>
+      <w:pPr>
+        <w:rPr>
+          <w:rFonts w:ascii="Times New Roman" w:hAnsi="Times New Roman" w:cs="Times New Roman"/>
+          <w:b/>
+          <w:bCs/>
+          <w:sz w:val="24"/>
+          <w:szCs w:val="24"/>
+        </w:rPr>
+      </w:pPr>
+      <w:r>
+        <w:rPr>
+          <w:rFonts w:ascii="Times New Roman" w:hAnsi="Times New Roman" w:cs="Times New Roman"/>
+          <w:b/>
+          <w:bCs/>
+          <w:sz w:val="24"/>
+          <w:szCs w:val="24"/>
         </w:rPr>
         <w:t>7. Assumptions</w:t>
       </w:r>
@@ -893,8 +1565,19 @@
           <w:ilvl w:val="0"/>
           <w:numId w:val="8"/>
         </w:numPr>
-      </w:pPr>
-      <w:r>
+        <w:ind w:left="0"/>
+        <w:rPr>
+          <w:rFonts w:ascii="Times New Roman" w:hAnsi="Times New Roman" w:cs="Times New Roman"/>
+          <w:sz w:val="24"/>
+          <w:szCs w:val="24"/>
+        </w:rPr>
+      </w:pPr>
+      <w:r>
+        <w:rPr>
+          <w:rFonts w:ascii="Times New Roman" w:hAnsi="Times New Roman" w:cs="Times New Roman"/>
+          <w:sz w:val="24"/>
+          <w:szCs w:val="24"/>
+        </w:rPr>
         <w:t>Mentors self-register and verify profiles via LinkedIn integration.</w:t>
       </w:r>
     </w:p>
@@ -904,16 +1587,37 @@
           <w:ilvl w:val="0"/>
           <w:numId w:val="8"/>
         </w:numPr>
-      </w:pPr>
-      <w:r>
+        <w:ind w:left="0"/>
+        <w:rPr>
+          <w:rFonts w:ascii="Times New Roman" w:hAnsi="Times New Roman" w:cs="Times New Roman"/>
+          <w:sz w:val="24"/>
+          <w:szCs w:val="24"/>
+        </w:rPr>
+      </w:pPr>
+      <w:r>
+        <w:rPr>
+          <w:rFonts w:ascii="Times New Roman" w:hAnsi="Times New Roman" w:cs="Times New Roman"/>
+          <w:sz w:val="24"/>
+          <w:szCs w:val="24"/>
+        </w:rPr>
         <w:t xml:space="preserve">Socio-economic and </w:t>
       </w:r>
       <w:proofErr w:type="spellStart"/>
       <w:r>
+        <w:rPr>
+          <w:rFonts w:ascii="Times New Roman" w:hAnsi="Times New Roman" w:cs="Times New Roman"/>
+          <w:sz w:val="24"/>
+          <w:szCs w:val="24"/>
+        </w:rPr>
         <w:t>behavioral</w:t>
       </w:r>
       <w:proofErr w:type="spellEnd"/>
       <w:r>
+        <w:rPr>
+          <w:rFonts w:ascii="Times New Roman" w:hAnsi="Times New Roman" w:cs="Times New Roman"/>
+          <w:sz w:val="24"/>
+          <w:szCs w:val="24"/>
+        </w:rPr>
         <w:t xml:space="preserve"> data is voluntarily provided by students.</w:t>
       </w:r>
     </w:p>
@@ -923,8 +1627,19 @@
           <w:ilvl w:val="0"/>
           <w:numId w:val="8"/>
         </w:numPr>
-      </w:pPr>
-      <w:r>
+        <w:ind w:left="0"/>
+        <w:rPr>
+          <w:rFonts w:ascii="Times New Roman" w:hAnsi="Times New Roman" w:cs="Times New Roman"/>
+          <w:sz w:val="24"/>
+          <w:szCs w:val="24"/>
+        </w:rPr>
+      </w:pPr>
+      <w:r>
+        <w:rPr>
+          <w:rFonts w:ascii="Times New Roman" w:hAnsi="Times New Roman" w:cs="Times New Roman"/>
+          <w:sz w:val="24"/>
+          <w:szCs w:val="24"/>
+        </w:rPr>
         <w:t>Regional/national income averages are sourced from public databases.</w:t>
       </w:r>
     </w:p>
@@ -934,8 +1649,19 @@
           <w:ilvl w:val="0"/>
           <w:numId w:val="8"/>
         </w:numPr>
-      </w:pPr>
-      <w:r>
+        <w:ind w:left="0"/>
+        <w:rPr>
+          <w:rFonts w:ascii="Times New Roman" w:hAnsi="Times New Roman" w:cs="Times New Roman"/>
+          <w:sz w:val="24"/>
+          <w:szCs w:val="24"/>
+        </w:rPr>
+      </w:pPr>
+      <w:r>
+        <w:rPr>
+          <w:rFonts w:ascii="Times New Roman" w:hAnsi="Times New Roman" w:cs="Times New Roman"/>
+          <w:sz w:val="24"/>
+          <w:szCs w:val="24"/>
+        </w:rPr>
         <w:t>Mobile responsiveness is prioritized over desktop-only features.</w:t>
       </w:r>
     </w:p>
@@ -945,12 +1671,31 @@
           <w:ilvl w:val="0"/>
           <w:numId w:val="8"/>
         </w:numPr>
-      </w:pPr>
-      <w:r>
+        <w:ind w:left="0"/>
+        <w:rPr>
+          <w:rFonts w:ascii="Times New Roman" w:hAnsi="Times New Roman" w:cs="Times New Roman"/>
+          <w:sz w:val="24"/>
+          <w:szCs w:val="24"/>
+        </w:rPr>
+      </w:pPr>
+      <w:r>
+        <w:rPr>
+          <w:rFonts w:ascii="Times New Roman" w:hAnsi="Times New Roman" w:cs="Times New Roman"/>
+          <w:sz w:val="24"/>
+          <w:szCs w:val="24"/>
+        </w:rPr>
         <w:t>Real-time notifications are delivered via email or in-app alerts.</w:t>
       </w:r>
     </w:p>
-    <w:p/>
+    <w:p>
+      <w:pPr>
+        <w:rPr>
+          <w:rFonts w:ascii="Times New Roman" w:hAnsi="Times New Roman" w:cs="Times New Roman"/>
+          <w:sz w:val="24"/>
+          <w:szCs w:val="24"/>
+        </w:rPr>
+      </w:pPr>
+    </w:p>
     <w:sectPr>
       <w:pgSz w:w="11906" w:h="16838"/>
       <w:pgMar w:top="1440" w:right="1440" w:bottom="1440" w:left="1440" w:header="708" w:footer="708" w:gutter="0"/>
@@ -2585,6 +3330,7 @@
   <w:style w:type="character" w:default="1" w:styleId="DefaultParagraphFont">
     <w:name w:val="Default Paragraph Font"/>
     <w:uiPriority w:val="1"/>
+    <w:semiHidden/>
     <w:unhideWhenUsed/>
   </w:style>
   <w:style w:type="table" w:default="1" w:styleId="TableNormal">

</xml_diff>